<commit_message>
Atualização de doc arquitetura, correção de uma linha
</commit_message>
<xml_diff>
--- a/docs/1_analise/Arquitetura_Sistema_v1.9.docx
+++ b/docs/1_analise/Arquitetura_Sistema_v1.9.docx
@@ -69,11 +69,7 @@
           </w:pPr>
           <w:r>
             <w:fldChar w:fldCharType="begin"/>
-          </w:r>
-          <w:r>
             <w:instrText>TOC \o "1-2" \h \z \u</w:instrText>
-          </w:r>
-          <w:r>
             <w:fldChar w:fldCharType="separate"/>
           </w:r>
           <w:hyperlink w:anchor="_Toc236683261" w:history="1">
@@ -90,46 +86,10 @@
                 <w:webHidden/>
               </w:rPr>
               <w:tab/>
-            </w:r>
-            <w:r>
-              <w:rPr>
-                <w:noProof/>
-                <w:webHidden/>
-              </w:rPr>
               <w:fldChar w:fldCharType="begin"/>
-            </w:r>
-            <w:r>
-              <w:rPr>
-                <w:noProof/>
-                <w:webHidden/>
-              </w:rPr>
               <w:instrText xml:space="preserve"> PAGEREF _Toc236683261 \h </w:instrText>
-            </w:r>
-            <w:r>
-              <w:rPr>
-                <w:noProof/>
-                <w:webHidden/>
-              </w:rPr>
-            </w:r>
-            <w:r>
-              <w:rPr>
-                <w:noProof/>
-                <w:webHidden/>
-              </w:rPr>
               <w:fldChar w:fldCharType="separate"/>
-            </w:r>
-            <w:r>
-              <w:rPr>
-                <w:noProof/>
-                <w:webHidden/>
-              </w:rPr>
               <w:t>2</w:t>
-            </w:r>
-            <w:r>
-              <w:rPr>
-                <w:noProof/>
-                <w:webHidden/>
-              </w:rPr>
               <w:fldChar w:fldCharType="end"/>
             </w:r>
           </w:hyperlink>
@@ -158,46 +118,10 @@
                 <w:webHidden/>
               </w:rPr>
               <w:tab/>
-            </w:r>
-            <w:r>
-              <w:rPr>
-                <w:noProof/>
-                <w:webHidden/>
-              </w:rPr>
               <w:fldChar w:fldCharType="begin"/>
-            </w:r>
-            <w:r>
-              <w:rPr>
-                <w:noProof/>
-                <w:webHidden/>
-              </w:rPr>
               <w:instrText xml:space="preserve"> PAGEREF _Toc236683262 \h </w:instrText>
-            </w:r>
-            <w:r>
-              <w:rPr>
-                <w:noProof/>
-                <w:webHidden/>
-              </w:rPr>
-            </w:r>
-            <w:r>
-              <w:rPr>
-                <w:noProof/>
-                <w:webHidden/>
-              </w:rPr>
               <w:fldChar w:fldCharType="separate"/>
-            </w:r>
-            <w:r>
-              <w:rPr>
-                <w:noProof/>
-                <w:webHidden/>
-              </w:rPr>
               <w:t>2</w:t>
-            </w:r>
-            <w:r>
-              <w:rPr>
-                <w:noProof/>
-                <w:webHidden/>
-              </w:rPr>
               <w:fldChar w:fldCharType="end"/>
             </w:r>
           </w:hyperlink>
@@ -226,46 +150,10 @@
                 <w:webHidden/>
               </w:rPr>
               <w:tab/>
-            </w:r>
-            <w:r>
-              <w:rPr>
-                <w:noProof/>
-                <w:webHidden/>
-              </w:rPr>
               <w:fldChar w:fldCharType="begin"/>
-            </w:r>
-            <w:r>
-              <w:rPr>
-                <w:noProof/>
-                <w:webHidden/>
-              </w:rPr>
               <w:instrText xml:space="preserve"> PAGEREF _Toc236683263 \h </w:instrText>
-            </w:r>
-            <w:r>
-              <w:rPr>
-                <w:noProof/>
-                <w:webHidden/>
-              </w:rPr>
-            </w:r>
-            <w:r>
-              <w:rPr>
-                <w:noProof/>
-                <w:webHidden/>
-              </w:rPr>
               <w:fldChar w:fldCharType="separate"/>
-            </w:r>
-            <w:r>
-              <w:rPr>
-                <w:noProof/>
-                <w:webHidden/>
-              </w:rPr>
               <w:t>3</w:t>
-            </w:r>
-            <w:r>
-              <w:rPr>
-                <w:noProof/>
-                <w:webHidden/>
-              </w:rPr>
               <w:fldChar w:fldCharType="end"/>
             </w:r>
           </w:hyperlink>
@@ -294,46 +182,10 @@
                 <w:webHidden/>
               </w:rPr>
               <w:tab/>
-            </w:r>
-            <w:r>
-              <w:rPr>
-                <w:noProof/>
-                <w:webHidden/>
-              </w:rPr>
               <w:fldChar w:fldCharType="begin"/>
-            </w:r>
-            <w:r>
-              <w:rPr>
-                <w:noProof/>
-                <w:webHidden/>
-              </w:rPr>
               <w:instrText xml:space="preserve"> PAGEREF _Toc236683264 \h </w:instrText>
-            </w:r>
-            <w:r>
-              <w:rPr>
-                <w:noProof/>
-                <w:webHidden/>
-              </w:rPr>
-            </w:r>
-            <w:r>
-              <w:rPr>
-                <w:noProof/>
-                <w:webHidden/>
-              </w:rPr>
               <w:fldChar w:fldCharType="separate"/>
-            </w:r>
-            <w:r>
-              <w:rPr>
-                <w:noProof/>
-                <w:webHidden/>
-              </w:rPr>
               <w:t>3</w:t>
-            </w:r>
-            <w:r>
-              <w:rPr>
-                <w:noProof/>
-                <w:webHidden/>
-              </w:rPr>
               <w:fldChar w:fldCharType="end"/>
             </w:r>
           </w:hyperlink>
@@ -362,46 +214,10 @@
                 <w:webHidden/>
               </w:rPr>
               <w:tab/>
-            </w:r>
-            <w:r>
-              <w:rPr>
-                <w:noProof/>
-                <w:webHidden/>
-              </w:rPr>
               <w:fldChar w:fldCharType="begin"/>
-            </w:r>
-            <w:r>
-              <w:rPr>
-                <w:noProof/>
-                <w:webHidden/>
-              </w:rPr>
               <w:instrText xml:space="preserve"> PAGEREF _Toc236683265 \h </w:instrText>
-            </w:r>
-            <w:r>
-              <w:rPr>
-                <w:noProof/>
-                <w:webHidden/>
-              </w:rPr>
-            </w:r>
-            <w:r>
-              <w:rPr>
-                <w:noProof/>
-                <w:webHidden/>
-              </w:rPr>
               <w:fldChar w:fldCharType="separate"/>
-            </w:r>
-            <w:r>
-              <w:rPr>
-                <w:noProof/>
-                <w:webHidden/>
-              </w:rPr>
               <w:t>3</w:t>
-            </w:r>
-            <w:r>
-              <w:rPr>
-                <w:noProof/>
-                <w:webHidden/>
-              </w:rPr>
               <w:fldChar w:fldCharType="end"/>
             </w:r>
           </w:hyperlink>
@@ -430,46 +246,10 @@
                 <w:webHidden/>
               </w:rPr>
               <w:tab/>
-            </w:r>
-            <w:r>
-              <w:rPr>
-                <w:noProof/>
-                <w:webHidden/>
-              </w:rPr>
               <w:fldChar w:fldCharType="begin"/>
-            </w:r>
-            <w:r>
-              <w:rPr>
-                <w:noProof/>
-                <w:webHidden/>
-              </w:rPr>
               <w:instrText xml:space="preserve"> PAGEREF _Toc236683266 \h </w:instrText>
-            </w:r>
-            <w:r>
-              <w:rPr>
-                <w:noProof/>
-                <w:webHidden/>
-              </w:rPr>
-            </w:r>
-            <w:r>
-              <w:rPr>
-                <w:noProof/>
-                <w:webHidden/>
-              </w:rPr>
               <w:fldChar w:fldCharType="separate"/>
-            </w:r>
-            <w:r>
-              <w:rPr>
-                <w:noProof/>
-                <w:webHidden/>
-              </w:rPr>
               <w:t>3</w:t>
-            </w:r>
-            <w:r>
-              <w:rPr>
-                <w:noProof/>
-                <w:webHidden/>
-              </w:rPr>
               <w:fldChar w:fldCharType="end"/>
             </w:r>
           </w:hyperlink>
@@ -498,46 +278,10 @@
                 <w:webHidden/>
               </w:rPr>
               <w:tab/>
-            </w:r>
-            <w:r>
-              <w:rPr>
-                <w:noProof/>
-                <w:webHidden/>
-              </w:rPr>
               <w:fldChar w:fldCharType="begin"/>
-            </w:r>
-            <w:r>
-              <w:rPr>
-                <w:noProof/>
-                <w:webHidden/>
-              </w:rPr>
               <w:instrText xml:space="preserve"> PAGEREF _Toc236683267 \h </w:instrText>
-            </w:r>
-            <w:r>
-              <w:rPr>
-                <w:noProof/>
-                <w:webHidden/>
-              </w:rPr>
-            </w:r>
-            <w:r>
-              <w:rPr>
-                <w:noProof/>
-                <w:webHidden/>
-              </w:rPr>
               <w:fldChar w:fldCharType="separate"/>
-            </w:r>
-            <w:r>
-              <w:rPr>
-                <w:noProof/>
-                <w:webHidden/>
-              </w:rPr>
               <w:t>4</w:t>
-            </w:r>
-            <w:r>
-              <w:rPr>
-                <w:noProof/>
-                <w:webHidden/>
-              </w:rPr>
               <w:fldChar w:fldCharType="end"/>
             </w:r>
           </w:hyperlink>
@@ -566,46 +310,10 @@
                 <w:webHidden/>
               </w:rPr>
               <w:tab/>
-            </w:r>
-            <w:r>
-              <w:rPr>
-                <w:noProof/>
-                <w:webHidden/>
-              </w:rPr>
               <w:fldChar w:fldCharType="begin"/>
-            </w:r>
-            <w:r>
-              <w:rPr>
-                <w:noProof/>
-                <w:webHidden/>
-              </w:rPr>
               <w:instrText xml:space="preserve"> PAGEREF _Toc236683268 \h </w:instrText>
-            </w:r>
-            <w:r>
-              <w:rPr>
-                <w:noProof/>
-                <w:webHidden/>
-              </w:rPr>
-            </w:r>
-            <w:r>
-              <w:rPr>
-                <w:noProof/>
-                <w:webHidden/>
-              </w:rPr>
               <w:fldChar w:fldCharType="separate"/>
-            </w:r>
-            <w:r>
-              <w:rPr>
-                <w:noProof/>
-                <w:webHidden/>
-              </w:rPr>
               <w:t>4</w:t>
-            </w:r>
-            <w:r>
-              <w:rPr>
-                <w:noProof/>
-                <w:webHidden/>
-              </w:rPr>
               <w:fldChar w:fldCharType="end"/>
             </w:r>
           </w:hyperlink>
@@ -634,46 +342,10 @@
                 <w:webHidden/>
               </w:rPr>
               <w:tab/>
-            </w:r>
-            <w:r>
-              <w:rPr>
-                <w:noProof/>
-                <w:webHidden/>
-              </w:rPr>
               <w:fldChar w:fldCharType="begin"/>
-            </w:r>
-            <w:r>
-              <w:rPr>
-                <w:noProof/>
-                <w:webHidden/>
-              </w:rPr>
               <w:instrText xml:space="preserve"> PAGEREF _Toc236683269 \h </w:instrText>
-            </w:r>
-            <w:r>
-              <w:rPr>
-                <w:noProof/>
-                <w:webHidden/>
-              </w:rPr>
-            </w:r>
-            <w:r>
-              <w:rPr>
-                <w:noProof/>
-                <w:webHidden/>
-              </w:rPr>
               <w:fldChar w:fldCharType="separate"/>
-            </w:r>
-            <w:r>
-              <w:rPr>
-                <w:noProof/>
-                <w:webHidden/>
-              </w:rPr>
               <w:t>4</w:t>
-            </w:r>
-            <w:r>
-              <w:rPr>
-                <w:noProof/>
-                <w:webHidden/>
-              </w:rPr>
               <w:fldChar w:fldCharType="end"/>
             </w:r>
           </w:hyperlink>
@@ -702,46 +374,10 @@
                 <w:webHidden/>
               </w:rPr>
               <w:tab/>
-            </w:r>
-            <w:r>
-              <w:rPr>
-                <w:noProof/>
-                <w:webHidden/>
-              </w:rPr>
               <w:fldChar w:fldCharType="begin"/>
-            </w:r>
-            <w:r>
-              <w:rPr>
-                <w:noProof/>
-                <w:webHidden/>
-              </w:rPr>
               <w:instrText xml:space="preserve"> PAGEREF _Toc236683270 \h </w:instrText>
-            </w:r>
-            <w:r>
-              <w:rPr>
-                <w:noProof/>
-                <w:webHidden/>
-              </w:rPr>
-            </w:r>
-            <w:r>
-              <w:rPr>
-                <w:noProof/>
-                <w:webHidden/>
-              </w:rPr>
               <w:fldChar w:fldCharType="separate"/>
-            </w:r>
-            <w:r>
-              <w:rPr>
-                <w:noProof/>
-                <w:webHidden/>
-              </w:rPr>
               <w:t>5</w:t>
-            </w:r>
-            <w:r>
-              <w:rPr>
-                <w:noProof/>
-                <w:webHidden/>
-              </w:rPr>
               <w:fldChar w:fldCharType="end"/>
             </w:r>
           </w:hyperlink>
@@ -770,46 +406,10 @@
                 <w:webHidden/>
               </w:rPr>
               <w:tab/>
-            </w:r>
-            <w:r>
-              <w:rPr>
-                <w:noProof/>
-                <w:webHidden/>
-              </w:rPr>
               <w:fldChar w:fldCharType="begin"/>
-            </w:r>
-            <w:r>
-              <w:rPr>
-                <w:noProof/>
-                <w:webHidden/>
-              </w:rPr>
               <w:instrText xml:space="preserve"> PAGEREF _Toc236683271 \h </w:instrText>
-            </w:r>
-            <w:r>
-              <w:rPr>
-                <w:noProof/>
-                <w:webHidden/>
-              </w:rPr>
-            </w:r>
-            <w:r>
-              <w:rPr>
-                <w:noProof/>
-                <w:webHidden/>
-              </w:rPr>
               <w:fldChar w:fldCharType="separate"/>
-            </w:r>
-            <w:r>
-              <w:rPr>
-                <w:noProof/>
-                <w:webHidden/>
-              </w:rPr>
               <w:t>5</w:t>
-            </w:r>
-            <w:r>
-              <w:rPr>
-                <w:noProof/>
-                <w:webHidden/>
-              </w:rPr>
               <w:fldChar w:fldCharType="end"/>
             </w:r>
           </w:hyperlink>
@@ -838,46 +438,10 @@
                 <w:webHidden/>
               </w:rPr>
               <w:tab/>
-            </w:r>
-            <w:r>
-              <w:rPr>
-                <w:noProof/>
-                <w:webHidden/>
-              </w:rPr>
               <w:fldChar w:fldCharType="begin"/>
-            </w:r>
-            <w:r>
-              <w:rPr>
-                <w:noProof/>
-                <w:webHidden/>
-              </w:rPr>
               <w:instrText xml:space="preserve"> PAGEREF _Toc236683272 \h </w:instrText>
-            </w:r>
-            <w:r>
-              <w:rPr>
-                <w:noProof/>
-                <w:webHidden/>
-              </w:rPr>
-            </w:r>
-            <w:r>
-              <w:rPr>
-                <w:noProof/>
-                <w:webHidden/>
-              </w:rPr>
               <w:fldChar w:fldCharType="separate"/>
-            </w:r>
-            <w:r>
-              <w:rPr>
-                <w:noProof/>
-                <w:webHidden/>
-              </w:rPr>
               <w:t>6</w:t>
-            </w:r>
-            <w:r>
-              <w:rPr>
-                <w:noProof/>
-                <w:webHidden/>
-              </w:rPr>
               <w:fldChar w:fldCharType="end"/>
             </w:r>
           </w:hyperlink>
@@ -906,46 +470,10 @@
                 <w:webHidden/>
               </w:rPr>
               <w:tab/>
-            </w:r>
-            <w:r>
-              <w:rPr>
-                <w:noProof/>
-                <w:webHidden/>
-              </w:rPr>
               <w:fldChar w:fldCharType="begin"/>
-            </w:r>
-            <w:r>
-              <w:rPr>
-                <w:noProof/>
-                <w:webHidden/>
-              </w:rPr>
               <w:instrText xml:space="preserve"> PAGEREF _Toc236683273 \h </w:instrText>
-            </w:r>
-            <w:r>
-              <w:rPr>
-                <w:noProof/>
-                <w:webHidden/>
-              </w:rPr>
-            </w:r>
-            <w:r>
-              <w:rPr>
-                <w:noProof/>
-                <w:webHidden/>
-              </w:rPr>
               <w:fldChar w:fldCharType="separate"/>
-            </w:r>
-            <w:r>
-              <w:rPr>
-                <w:noProof/>
-                <w:webHidden/>
-              </w:rPr>
               <w:t>6</w:t>
-            </w:r>
-            <w:r>
-              <w:rPr>
-                <w:noProof/>
-                <w:webHidden/>
-              </w:rPr>
               <w:fldChar w:fldCharType="end"/>
             </w:r>
           </w:hyperlink>
@@ -974,46 +502,10 @@
                 <w:webHidden/>
               </w:rPr>
               <w:tab/>
-            </w:r>
-            <w:r>
-              <w:rPr>
-                <w:noProof/>
-                <w:webHidden/>
-              </w:rPr>
               <w:fldChar w:fldCharType="begin"/>
-            </w:r>
-            <w:r>
-              <w:rPr>
-                <w:noProof/>
-                <w:webHidden/>
-              </w:rPr>
               <w:instrText xml:space="preserve"> PAGEREF _Toc236683274 \h </w:instrText>
-            </w:r>
-            <w:r>
-              <w:rPr>
-                <w:noProof/>
-                <w:webHidden/>
-              </w:rPr>
-            </w:r>
-            <w:r>
-              <w:rPr>
-                <w:noProof/>
-                <w:webHidden/>
-              </w:rPr>
               <w:fldChar w:fldCharType="separate"/>
-            </w:r>
-            <w:r>
-              <w:rPr>
-                <w:noProof/>
-                <w:webHidden/>
-              </w:rPr>
               <w:t>6</w:t>
-            </w:r>
-            <w:r>
-              <w:rPr>
-                <w:noProof/>
-                <w:webHidden/>
-              </w:rPr>
               <w:fldChar w:fldCharType="end"/>
             </w:r>
           </w:hyperlink>
@@ -1042,46 +534,10 @@
                 <w:webHidden/>
               </w:rPr>
               <w:tab/>
-            </w:r>
-            <w:r>
-              <w:rPr>
-                <w:noProof/>
-                <w:webHidden/>
-              </w:rPr>
               <w:fldChar w:fldCharType="begin"/>
-            </w:r>
-            <w:r>
-              <w:rPr>
-                <w:noProof/>
-                <w:webHidden/>
-              </w:rPr>
               <w:instrText xml:space="preserve"> PAGEREF _Toc236683275 \h </w:instrText>
-            </w:r>
-            <w:r>
-              <w:rPr>
-                <w:noProof/>
-                <w:webHidden/>
-              </w:rPr>
-            </w:r>
-            <w:r>
-              <w:rPr>
-                <w:noProof/>
-                <w:webHidden/>
-              </w:rPr>
               <w:fldChar w:fldCharType="separate"/>
-            </w:r>
-            <w:r>
-              <w:rPr>
-                <w:noProof/>
-                <w:webHidden/>
-              </w:rPr>
               <w:t>6</w:t>
-            </w:r>
-            <w:r>
-              <w:rPr>
-                <w:noProof/>
-                <w:webHidden/>
-              </w:rPr>
               <w:fldChar w:fldCharType="end"/>
             </w:r>
           </w:hyperlink>
@@ -1110,46 +566,10 @@
                 <w:webHidden/>
               </w:rPr>
               <w:tab/>
-            </w:r>
-            <w:r>
-              <w:rPr>
-                <w:noProof/>
-                <w:webHidden/>
-              </w:rPr>
               <w:fldChar w:fldCharType="begin"/>
-            </w:r>
-            <w:r>
-              <w:rPr>
-                <w:noProof/>
-                <w:webHidden/>
-              </w:rPr>
               <w:instrText xml:space="preserve"> PAGEREF _Toc236683276 \h </w:instrText>
-            </w:r>
-            <w:r>
-              <w:rPr>
-                <w:noProof/>
-                <w:webHidden/>
-              </w:rPr>
-            </w:r>
-            <w:r>
-              <w:rPr>
-                <w:noProof/>
-                <w:webHidden/>
-              </w:rPr>
               <w:fldChar w:fldCharType="separate"/>
-            </w:r>
-            <w:r>
-              <w:rPr>
-                <w:noProof/>
-                <w:webHidden/>
-              </w:rPr>
               <w:t>7</w:t>
-            </w:r>
-            <w:r>
-              <w:rPr>
-                <w:noProof/>
-                <w:webHidden/>
-              </w:rPr>
               <w:fldChar w:fldCharType="end"/>
             </w:r>
           </w:hyperlink>
@@ -1178,46 +598,10 @@
                 <w:webHidden/>
               </w:rPr>
               <w:tab/>
-            </w:r>
-            <w:r>
-              <w:rPr>
-                <w:noProof/>
-                <w:webHidden/>
-              </w:rPr>
               <w:fldChar w:fldCharType="begin"/>
-            </w:r>
-            <w:r>
-              <w:rPr>
-                <w:noProof/>
-                <w:webHidden/>
-              </w:rPr>
               <w:instrText xml:space="preserve"> PAGEREF _Toc236683277 \h </w:instrText>
-            </w:r>
-            <w:r>
-              <w:rPr>
-                <w:noProof/>
-                <w:webHidden/>
-              </w:rPr>
-            </w:r>
-            <w:r>
-              <w:rPr>
-                <w:noProof/>
-                <w:webHidden/>
-              </w:rPr>
               <w:fldChar w:fldCharType="separate"/>
-            </w:r>
-            <w:r>
-              <w:rPr>
-                <w:noProof/>
-                <w:webHidden/>
-              </w:rPr>
               <w:t>7</w:t>
-            </w:r>
-            <w:r>
-              <w:rPr>
-                <w:noProof/>
-                <w:webHidden/>
-              </w:rPr>
               <w:fldChar w:fldCharType="end"/>
             </w:r>
           </w:hyperlink>
@@ -1246,46 +630,10 @@
                 <w:webHidden/>
               </w:rPr>
               <w:tab/>
-            </w:r>
-            <w:r>
-              <w:rPr>
-                <w:noProof/>
-                <w:webHidden/>
-              </w:rPr>
               <w:fldChar w:fldCharType="begin"/>
-            </w:r>
-            <w:r>
-              <w:rPr>
-                <w:noProof/>
-                <w:webHidden/>
-              </w:rPr>
               <w:instrText xml:space="preserve"> PAGEREF _Toc236683278 \h </w:instrText>
-            </w:r>
-            <w:r>
-              <w:rPr>
-                <w:noProof/>
-                <w:webHidden/>
-              </w:rPr>
-            </w:r>
-            <w:r>
-              <w:rPr>
-                <w:noProof/>
-                <w:webHidden/>
-              </w:rPr>
               <w:fldChar w:fldCharType="separate"/>
-            </w:r>
-            <w:r>
-              <w:rPr>
-                <w:noProof/>
-                <w:webHidden/>
-              </w:rPr>
               <w:t>7</w:t>
-            </w:r>
-            <w:r>
-              <w:rPr>
-                <w:noProof/>
-                <w:webHidden/>
-              </w:rPr>
               <w:fldChar w:fldCharType="end"/>
             </w:r>
           </w:hyperlink>
@@ -1314,46 +662,10 @@
                 <w:webHidden/>
               </w:rPr>
               <w:tab/>
-            </w:r>
-            <w:r>
-              <w:rPr>
-                <w:noProof/>
-                <w:webHidden/>
-              </w:rPr>
               <w:fldChar w:fldCharType="begin"/>
-            </w:r>
-            <w:r>
-              <w:rPr>
-                <w:noProof/>
-                <w:webHidden/>
-              </w:rPr>
               <w:instrText xml:space="preserve"> PAGEREF _Toc236683279 \h </w:instrText>
-            </w:r>
-            <w:r>
-              <w:rPr>
-                <w:noProof/>
-                <w:webHidden/>
-              </w:rPr>
-            </w:r>
-            <w:r>
-              <w:rPr>
-                <w:noProof/>
-                <w:webHidden/>
-              </w:rPr>
               <w:fldChar w:fldCharType="separate"/>
-            </w:r>
-            <w:r>
-              <w:rPr>
-                <w:noProof/>
-                <w:webHidden/>
-              </w:rPr>
               <w:t>8</w:t>
-            </w:r>
-            <w:r>
-              <w:rPr>
-                <w:noProof/>
-                <w:webHidden/>
-              </w:rPr>
               <w:fldChar w:fldCharType="end"/>
             </w:r>
           </w:hyperlink>
@@ -1382,46 +694,10 @@
                 <w:webHidden/>
               </w:rPr>
               <w:tab/>
-            </w:r>
-            <w:r>
-              <w:rPr>
-                <w:noProof/>
-                <w:webHidden/>
-              </w:rPr>
               <w:fldChar w:fldCharType="begin"/>
-            </w:r>
-            <w:r>
-              <w:rPr>
-                <w:noProof/>
-                <w:webHidden/>
-              </w:rPr>
               <w:instrText xml:space="preserve"> PAGEREF _Toc236683280 \h </w:instrText>
-            </w:r>
-            <w:r>
-              <w:rPr>
-                <w:noProof/>
-                <w:webHidden/>
-              </w:rPr>
-            </w:r>
-            <w:r>
-              <w:rPr>
-                <w:noProof/>
-                <w:webHidden/>
-              </w:rPr>
               <w:fldChar w:fldCharType="separate"/>
-            </w:r>
-            <w:r>
-              <w:rPr>
-                <w:noProof/>
-                <w:webHidden/>
-              </w:rPr>
               <w:t>9</w:t>
-            </w:r>
-            <w:r>
-              <w:rPr>
-                <w:noProof/>
-                <w:webHidden/>
-              </w:rPr>
               <w:fldChar w:fldCharType="end"/>
             </w:r>
           </w:hyperlink>
@@ -1450,46 +726,10 @@
                 <w:webHidden/>
               </w:rPr>
               <w:tab/>
-            </w:r>
-            <w:r>
-              <w:rPr>
-                <w:noProof/>
-                <w:webHidden/>
-              </w:rPr>
               <w:fldChar w:fldCharType="begin"/>
-            </w:r>
-            <w:r>
-              <w:rPr>
-                <w:noProof/>
-                <w:webHidden/>
-              </w:rPr>
               <w:instrText xml:space="preserve"> PAGEREF _Toc236683281 \h </w:instrText>
-            </w:r>
-            <w:r>
-              <w:rPr>
-                <w:noProof/>
-                <w:webHidden/>
-              </w:rPr>
-            </w:r>
-            <w:r>
-              <w:rPr>
-                <w:noProof/>
-                <w:webHidden/>
-              </w:rPr>
               <w:fldChar w:fldCharType="separate"/>
-            </w:r>
-            <w:r>
-              <w:rPr>
-                <w:noProof/>
-                <w:webHidden/>
-              </w:rPr>
               <w:t>9</w:t>
-            </w:r>
-            <w:r>
-              <w:rPr>
-                <w:noProof/>
-                <w:webHidden/>
-              </w:rPr>
               <w:fldChar w:fldCharType="end"/>
             </w:r>
           </w:hyperlink>
@@ -1518,46 +758,10 @@
                 <w:webHidden/>
               </w:rPr>
               <w:tab/>
-            </w:r>
-            <w:r>
-              <w:rPr>
-                <w:noProof/>
-                <w:webHidden/>
-              </w:rPr>
               <w:fldChar w:fldCharType="begin"/>
-            </w:r>
-            <w:r>
-              <w:rPr>
-                <w:noProof/>
-                <w:webHidden/>
-              </w:rPr>
               <w:instrText xml:space="preserve"> PAGEREF _Toc236683282 \h </w:instrText>
-            </w:r>
-            <w:r>
-              <w:rPr>
-                <w:noProof/>
-                <w:webHidden/>
-              </w:rPr>
-            </w:r>
-            <w:r>
-              <w:rPr>
-                <w:noProof/>
-                <w:webHidden/>
-              </w:rPr>
               <w:fldChar w:fldCharType="separate"/>
-            </w:r>
-            <w:r>
-              <w:rPr>
-                <w:noProof/>
-                <w:webHidden/>
-              </w:rPr>
               <w:t>9</w:t>
-            </w:r>
-            <w:r>
-              <w:rPr>
-                <w:noProof/>
-                <w:webHidden/>
-              </w:rPr>
               <w:fldChar w:fldCharType="end"/>
             </w:r>
           </w:hyperlink>
@@ -1586,46 +790,10 @@
                 <w:webHidden/>
               </w:rPr>
               <w:tab/>
-            </w:r>
-            <w:r>
-              <w:rPr>
-                <w:noProof/>
-                <w:webHidden/>
-              </w:rPr>
               <w:fldChar w:fldCharType="begin"/>
-            </w:r>
-            <w:r>
-              <w:rPr>
-                <w:noProof/>
-                <w:webHidden/>
-              </w:rPr>
               <w:instrText xml:space="preserve"> PAGEREF _Toc236683283 \h </w:instrText>
-            </w:r>
-            <w:r>
-              <w:rPr>
-                <w:noProof/>
-                <w:webHidden/>
-              </w:rPr>
-            </w:r>
-            <w:r>
-              <w:rPr>
-                <w:noProof/>
-                <w:webHidden/>
-              </w:rPr>
               <w:fldChar w:fldCharType="separate"/>
-            </w:r>
-            <w:r>
-              <w:rPr>
-                <w:noProof/>
-                <w:webHidden/>
-              </w:rPr>
               <w:t>9</w:t>
-            </w:r>
-            <w:r>
-              <w:rPr>
-                <w:noProof/>
-                <w:webHidden/>
-              </w:rPr>
               <w:fldChar w:fldCharType="end"/>
             </w:r>
           </w:hyperlink>
@@ -1654,46 +822,10 @@
                 <w:webHidden/>
               </w:rPr>
               <w:tab/>
-            </w:r>
-            <w:r>
-              <w:rPr>
-                <w:noProof/>
-                <w:webHidden/>
-              </w:rPr>
               <w:fldChar w:fldCharType="begin"/>
-            </w:r>
-            <w:r>
-              <w:rPr>
-                <w:noProof/>
-                <w:webHidden/>
-              </w:rPr>
               <w:instrText xml:space="preserve"> PAGEREF _Toc236683284 \h </w:instrText>
-            </w:r>
-            <w:r>
-              <w:rPr>
-                <w:noProof/>
-                <w:webHidden/>
-              </w:rPr>
-            </w:r>
-            <w:r>
-              <w:rPr>
-                <w:noProof/>
-                <w:webHidden/>
-              </w:rPr>
               <w:fldChar w:fldCharType="separate"/>
-            </w:r>
-            <w:r>
-              <w:rPr>
-                <w:noProof/>
-                <w:webHidden/>
-              </w:rPr>
               <w:t>10</w:t>
-            </w:r>
-            <w:r>
-              <w:rPr>
-                <w:noProof/>
-                <w:webHidden/>
-              </w:rPr>
               <w:fldChar w:fldCharType="end"/>
             </w:r>
           </w:hyperlink>
@@ -1722,46 +854,10 @@
                 <w:webHidden/>
               </w:rPr>
               <w:tab/>
-            </w:r>
-            <w:r>
-              <w:rPr>
-                <w:noProof/>
-                <w:webHidden/>
-              </w:rPr>
               <w:fldChar w:fldCharType="begin"/>
-            </w:r>
-            <w:r>
-              <w:rPr>
-                <w:noProof/>
-                <w:webHidden/>
-              </w:rPr>
               <w:instrText xml:space="preserve"> PAGEREF _Toc236683285 \h </w:instrText>
-            </w:r>
-            <w:r>
-              <w:rPr>
-                <w:noProof/>
-                <w:webHidden/>
-              </w:rPr>
-            </w:r>
-            <w:r>
-              <w:rPr>
-                <w:noProof/>
-                <w:webHidden/>
-              </w:rPr>
               <w:fldChar w:fldCharType="separate"/>
-            </w:r>
-            <w:r>
-              <w:rPr>
-                <w:noProof/>
-                <w:webHidden/>
-              </w:rPr>
               <w:t>10</w:t>
-            </w:r>
-            <w:r>
-              <w:rPr>
-                <w:noProof/>
-                <w:webHidden/>
-              </w:rPr>
               <w:fldChar w:fldCharType="end"/>
             </w:r>
           </w:hyperlink>
@@ -1790,46 +886,10 @@
                 <w:webHidden/>
               </w:rPr>
               <w:tab/>
-            </w:r>
-            <w:r>
-              <w:rPr>
-                <w:noProof/>
-                <w:webHidden/>
-              </w:rPr>
               <w:fldChar w:fldCharType="begin"/>
-            </w:r>
-            <w:r>
-              <w:rPr>
-                <w:noProof/>
-                <w:webHidden/>
-              </w:rPr>
               <w:instrText xml:space="preserve"> PAGEREF _Toc236683286 \h </w:instrText>
-            </w:r>
-            <w:r>
-              <w:rPr>
-                <w:noProof/>
-                <w:webHidden/>
-              </w:rPr>
-            </w:r>
-            <w:r>
-              <w:rPr>
-                <w:noProof/>
-                <w:webHidden/>
-              </w:rPr>
               <w:fldChar w:fldCharType="separate"/>
-            </w:r>
-            <w:r>
-              <w:rPr>
-                <w:noProof/>
-                <w:webHidden/>
-              </w:rPr>
               <w:t>10</w:t>
-            </w:r>
-            <w:r>
-              <w:rPr>
-                <w:noProof/>
-                <w:webHidden/>
-              </w:rPr>
               <w:fldChar w:fldCharType="end"/>
             </w:r>
           </w:hyperlink>
@@ -1858,46 +918,10 @@
                 <w:webHidden/>
               </w:rPr>
               <w:tab/>
-            </w:r>
-            <w:r>
-              <w:rPr>
-                <w:noProof/>
-                <w:webHidden/>
-              </w:rPr>
               <w:fldChar w:fldCharType="begin"/>
-            </w:r>
-            <w:r>
-              <w:rPr>
-                <w:noProof/>
-                <w:webHidden/>
-              </w:rPr>
               <w:instrText xml:space="preserve"> PAGEREF _Toc236683287 \h </w:instrText>
-            </w:r>
-            <w:r>
-              <w:rPr>
-                <w:noProof/>
-                <w:webHidden/>
-              </w:rPr>
-            </w:r>
-            <w:r>
-              <w:rPr>
-                <w:noProof/>
-                <w:webHidden/>
-              </w:rPr>
               <w:fldChar w:fldCharType="separate"/>
-            </w:r>
-            <w:r>
-              <w:rPr>
-                <w:noProof/>
-                <w:webHidden/>
-              </w:rPr>
               <w:t>11</w:t>
-            </w:r>
-            <w:r>
-              <w:rPr>
-                <w:noProof/>
-                <w:webHidden/>
-              </w:rPr>
               <w:fldChar w:fldCharType="end"/>
             </w:r>
           </w:hyperlink>
@@ -1926,46 +950,10 @@
                 <w:webHidden/>
               </w:rPr>
               <w:tab/>
-            </w:r>
-            <w:r>
-              <w:rPr>
-                <w:noProof/>
-                <w:webHidden/>
-              </w:rPr>
               <w:fldChar w:fldCharType="begin"/>
-            </w:r>
-            <w:r>
-              <w:rPr>
-                <w:noProof/>
-                <w:webHidden/>
-              </w:rPr>
               <w:instrText xml:space="preserve"> PAGEREF _Toc236683288 \h </w:instrText>
-            </w:r>
-            <w:r>
-              <w:rPr>
-                <w:noProof/>
-                <w:webHidden/>
-              </w:rPr>
-            </w:r>
-            <w:r>
-              <w:rPr>
-                <w:noProof/>
-                <w:webHidden/>
-              </w:rPr>
               <w:fldChar w:fldCharType="separate"/>
-            </w:r>
-            <w:r>
-              <w:rPr>
-                <w:noProof/>
-                <w:webHidden/>
-              </w:rPr>
               <w:t>11</w:t>
-            </w:r>
-            <w:r>
-              <w:rPr>
-                <w:noProof/>
-                <w:webHidden/>
-              </w:rPr>
               <w:fldChar w:fldCharType="end"/>
             </w:r>
           </w:hyperlink>
@@ -1994,46 +982,10 @@
                 <w:webHidden/>
               </w:rPr>
               <w:tab/>
-            </w:r>
-            <w:r>
-              <w:rPr>
-                <w:noProof/>
-                <w:webHidden/>
-              </w:rPr>
               <w:fldChar w:fldCharType="begin"/>
-            </w:r>
-            <w:r>
-              <w:rPr>
-                <w:noProof/>
-                <w:webHidden/>
-              </w:rPr>
               <w:instrText xml:space="preserve"> PAGEREF _Toc236683289 \h </w:instrText>
-            </w:r>
-            <w:r>
-              <w:rPr>
-                <w:noProof/>
-                <w:webHidden/>
-              </w:rPr>
-            </w:r>
-            <w:r>
-              <w:rPr>
-                <w:noProof/>
-                <w:webHidden/>
-              </w:rPr>
               <w:fldChar w:fldCharType="separate"/>
-            </w:r>
-            <w:r>
-              <w:rPr>
-                <w:noProof/>
-                <w:webHidden/>
-              </w:rPr>
               <w:t>12</w:t>
-            </w:r>
-            <w:r>
-              <w:rPr>
-                <w:noProof/>
-                <w:webHidden/>
-              </w:rPr>
               <w:fldChar w:fldCharType="end"/>
             </w:r>
           </w:hyperlink>
@@ -2062,46 +1014,10 @@
                 <w:webHidden/>
               </w:rPr>
               <w:tab/>
-            </w:r>
-            <w:r>
-              <w:rPr>
-                <w:noProof/>
-                <w:webHidden/>
-              </w:rPr>
               <w:fldChar w:fldCharType="begin"/>
-            </w:r>
-            <w:r>
-              <w:rPr>
-                <w:noProof/>
-                <w:webHidden/>
-              </w:rPr>
               <w:instrText xml:space="preserve"> PAGEREF _Toc236683290 \h </w:instrText>
-            </w:r>
-            <w:r>
-              <w:rPr>
-                <w:noProof/>
-                <w:webHidden/>
-              </w:rPr>
-            </w:r>
-            <w:r>
-              <w:rPr>
-                <w:noProof/>
-                <w:webHidden/>
-              </w:rPr>
               <w:fldChar w:fldCharType="separate"/>
-            </w:r>
-            <w:r>
-              <w:rPr>
-                <w:noProof/>
-                <w:webHidden/>
-              </w:rPr>
               <w:t>12</w:t>
-            </w:r>
-            <w:r>
-              <w:rPr>
-                <w:noProof/>
-                <w:webHidden/>
-              </w:rPr>
               <w:fldChar w:fldCharType="end"/>
             </w:r>
           </w:hyperlink>
@@ -2130,46 +1046,10 @@
                 <w:webHidden/>
               </w:rPr>
               <w:tab/>
-            </w:r>
-            <w:r>
-              <w:rPr>
-                <w:noProof/>
-                <w:webHidden/>
-              </w:rPr>
               <w:fldChar w:fldCharType="begin"/>
-            </w:r>
-            <w:r>
-              <w:rPr>
-                <w:noProof/>
-                <w:webHidden/>
-              </w:rPr>
               <w:instrText xml:space="preserve"> PAGEREF _Toc236683291 \h </w:instrText>
-            </w:r>
-            <w:r>
-              <w:rPr>
-                <w:noProof/>
-                <w:webHidden/>
-              </w:rPr>
-            </w:r>
-            <w:r>
-              <w:rPr>
-                <w:noProof/>
-                <w:webHidden/>
-              </w:rPr>
               <w:fldChar w:fldCharType="separate"/>
-            </w:r>
-            <w:r>
-              <w:rPr>
-                <w:noProof/>
-                <w:webHidden/>
-              </w:rPr>
               <w:t>13</w:t>
-            </w:r>
-            <w:r>
-              <w:rPr>
-                <w:noProof/>
-                <w:webHidden/>
-              </w:rPr>
               <w:fldChar w:fldCharType="end"/>
             </w:r>
           </w:hyperlink>
@@ -2198,46 +1078,10 @@
                 <w:webHidden/>
               </w:rPr>
               <w:tab/>
-            </w:r>
-            <w:r>
-              <w:rPr>
-                <w:noProof/>
-                <w:webHidden/>
-              </w:rPr>
               <w:fldChar w:fldCharType="begin"/>
-            </w:r>
-            <w:r>
-              <w:rPr>
-                <w:noProof/>
-                <w:webHidden/>
-              </w:rPr>
               <w:instrText xml:space="preserve"> PAGEREF _Toc236683292 \h </w:instrText>
-            </w:r>
-            <w:r>
-              <w:rPr>
-                <w:noProof/>
-                <w:webHidden/>
-              </w:rPr>
-            </w:r>
-            <w:r>
-              <w:rPr>
-                <w:noProof/>
-                <w:webHidden/>
-              </w:rPr>
               <w:fldChar w:fldCharType="separate"/>
-            </w:r>
-            <w:r>
-              <w:rPr>
-                <w:noProof/>
-                <w:webHidden/>
-              </w:rPr>
               <w:t>13</w:t>
-            </w:r>
-            <w:r>
-              <w:rPr>
-                <w:noProof/>
-                <w:webHidden/>
-              </w:rPr>
               <w:fldChar w:fldCharType="end"/>
             </w:r>
           </w:hyperlink>
@@ -2266,46 +1110,10 @@
                 <w:webHidden/>
               </w:rPr>
               <w:tab/>
-            </w:r>
-            <w:r>
-              <w:rPr>
-                <w:noProof/>
-                <w:webHidden/>
-              </w:rPr>
               <w:fldChar w:fldCharType="begin"/>
-            </w:r>
-            <w:r>
-              <w:rPr>
-                <w:noProof/>
-                <w:webHidden/>
-              </w:rPr>
               <w:instrText xml:space="preserve"> PAGEREF _Toc236683293 \h </w:instrText>
-            </w:r>
-            <w:r>
-              <w:rPr>
-                <w:noProof/>
-                <w:webHidden/>
-              </w:rPr>
-            </w:r>
-            <w:r>
-              <w:rPr>
-                <w:noProof/>
-                <w:webHidden/>
-              </w:rPr>
               <w:fldChar w:fldCharType="separate"/>
-            </w:r>
-            <w:r>
-              <w:rPr>
-                <w:noProof/>
-                <w:webHidden/>
-              </w:rPr>
               <w:t>14</w:t>
-            </w:r>
-            <w:r>
-              <w:rPr>
-                <w:noProof/>
-                <w:webHidden/>
-              </w:rPr>
               <w:fldChar w:fldCharType="end"/>
             </w:r>
           </w:hyperlink>
@@ -2334,46 +1142,10 @@
                 <w:webHidden/>
               </w:rPr>
               <w:tab/>
-            </w:r>
-            <w:r>
-              <w:rPr>
-                <w:noProof/>
-                <w:webHidden/>
-              </w:rPr>
               <w:fldChar w:fldCharType="begin"/>
-            </w:r>
-            <w:r>
-              <w:rPr>
-                <w:noProof/>
-                <w:webHidden/>
-              </w:rPr>
               <w:instrText xml:space="preserve"> PAGEREF _Toc236683294 \h </w:instrText>
-            </w:r>
-            <w:r>
-              <w:rPr>
-                <w:noProof/>
-                <w:webHidden/>
-              </w:rPr>
-            </w:r>
-            <w:r>
-              <w:rPr>
-                <w:noProof/>
-                <w:webHidden/>
-              </w:rPr>
               <w:fldChar w:fldCharType="separate"/>
-            </w:r>
-            <w:r>
-              <w:rPr>
-                <w:noProof/>
-                <w:webHidden/>
-              </w:rPr>
               <w:t>14</w:t>
-            </w:r>
-            <w:r>
-              <w:rPr>
-                <w:noProof/>
-                <w:webHidden/>
-              </w:rPr>
               <w:fldChar w:fldCharType="end"/>
             </w:r>
           </w:hyperlink>
@@ -2402,46 +1174,10 @@
                 <w:webHidden/>
               </w:rPr>
               <w:tab/>
-            </w:r>
-            <w:r>
-              <w:rPr>
-                <w:noProof/>
-                <w:webHidden/>
-              </w:rPr>
               <w:fldChar w:fldCharType="begin"/>
-            </w:r>
-            <w:r>
-              <w:rPr>
-                <w:noProof/>
-                <w:webHidden/>
-              </w:rPr>
               <w:instrText xml:space="preserve"> PAGEREF _Toc236683295 \h </w:instrText>
-            </w:r>
-            <w:r>
-              <w:rPr>
-                <w:noProof/>
-                <w:webHidden/>
-              </w:rPr>
-            </w:r>
-            <w:r>
-              <w:rPr>
-                <w:noProof/>
-                <w:webHidden/>
-              </w:rPr>
               <w:fldChar w:fldCharType="separate"/>
-            </w:r>
-            <w:r>
-              <w:rPr>
-                <w:noProof/>
-                <w:webHidden/>
-              </w:rPr>
               <w:t>15</w:t>
-            </w:r>
-            <w:r>
-              <w:rPr>
-                <w:noProof/>
-                <w:webHidden/>
-              </w:rPr>
               <w:fldChar w:fldCharType="end"/>
             </w:r>
           </w:hyperlink>
@@ -2592,46 +1328,10 @@
                 <w:webHidden/>
               </w:rPr>
               <w:tab/>
-            </w:r>
-            <w:r>
-              <w:rPr>
-                <w:noProof/>
-                <w:webHidden/>
-              </w:rPr>
               <w:fldChar w:fldCharType="begin"/>
-            </w:r>
-            <w:r>
-              <w:rPr>
-                <w:noProof/>
-                <w:webHidden/>
-              </w:rPr>
               <w:instrText xml:space="preserve"> PAGEREF _Toc236683296 \h </w:instrText>
-            </w:r>
-            <w:r>
-              <w:rPr>
-                <w:noProof/>
-                <w:webHidden/>
-              </w:rPr>
-            </w:r>
-            <w:r>
-              <w:rPr>
-                <w:noProof/>
-                <w:webHidden/>
-              </w:rPr>
               <w:fldChar w:fldCharType="separate"/>
-            </w:r>
-            <w:r>
-              <w:rPr>
-                <w:noProof/>
-                <w:webHidden/>
-              </w:rPr>
               <w:t>15</w:t>
-            </w:r>
-            <w:r>
-              <w:rPr>
-                <w:noProof/>
-                <w:webHidden/>
-              </w:rPr>
               <w:fldChar w:fldCharType="end"/>
             </w:r>
           </w:hyperlink>
@@ -2660,46 +1360,10 @@
                 <w:webHidden/>
               </w:rPr>
               <w:tab/>
-            </w:r>
-            <w:r>
-              <w:rPr>
-                <w:noProof/>
-                <w:webHidden/>
-              </w:rPr>
               <w:fldChar w:fldCharType="begin"/>
-            </w:r>
-            <w:r>
-              <w:rPr>
-                <w:noProof/>
-                <w:webHidden/>
-              </w:rPr>
               <w:instrText xml:space="preserve"> PAGEREF _Toc236683297 \h </w:instrText>
-            </w:r>
-            <w:r>
-              <w:rPr>
-                <w:noProof/>
-                <w:webHidden/>
-              </w:rPr>
-            </w:r>
-            <w:r>
-              <w:rPr>
-                <w:noProof/>
-                <w:webHidden/>
-              </w:rPr>
               <w:fldChar w:fldCharType="separate"/>
-            </w:r>
-            <w:r>
-              <w:rPr>
-                <w:noProof/>
-                <w:webHidden/>
-              </w:rPr>
               <w:t>15</w:t>
-            </w:r>
-            <w:r>
-              <w:rPr>
-                <w:noProof/>
-                <w:webHidden/>
-              </w:rPr>
               <w:fldChar w:fldCharType="end"/>
             </w:r>
           </w:hyperlink>
@@ -2728,46 +1392,10 @@
                 <w:webHidden/>
               </w:rPr>
               <w:tab/>
-            </w:r>
-            <w:r>
-              <w:rPr>
-                <w:noProof/>
-                <w:webHidden/>
-              </w:rPr>
               <w:fldChar w:fldCharType="begin"/>
-            </w:r>
-            <w:r>
-              <w:rPr>
-                <w:noProof/>
-                <w:webHidden/>
-              </w:rPr>
               <w:instrText xml:space="preserve"> PAGEREF _Toc236683298 \h </w:instrText>
-            </w:r>
-            <w:r>
-              <w:rPr>
-                <w:noProof/>
-                <w:webHidden/>
-              </w:rPr>
-            </w:r>
-            <w:r>
-              <w:rPr>
-                <w:noProof/>
-                <w:webHidden/>
-              </w:rPr>
               <w:fldChar w:fldCharType="separate"/>
-            </w:r>
-            <w:r>
-              <w:rPr>
-                <w:noProof/>
-                <w:webHidden/>
-              </w:rPr>
               <w:t>16</w:t>
-            </w:r>
-            <w:r>
-              <w:rPr>
-                <w:noProof/>
-                <w:webHidden/>
-              </w:rPr>
               <w:fldChar w:fldCharType="end"/>
             </w:r>
           </w:hyperlink>
@@ -2796,46 +1424,10 @@
                 <w:webHidden/>
               </w:rPr>
               <w:tab/>
-            </w:r>
-            <w:r>
-              <w:rPr>
-                <w:noProof/>
-                <w:webHidden/>
-              </w:rPr>
               <w:fldChar w:fldCharType="begin"/>
-            </w:r>
-            <w:r>
-              <w:rPr>
-                <w:noProof/>
-                <w:webHidden/>
-              </w:rPr>
               <w:instrText xml:space="preserve"> PAGEREF _Toc236683299 \h </w:instrText>
-            </w:r>
-            <w:r>
-              <w:rPr>
-                <w:noProof/>
-                <w:webHidden/>
-              </w:rPr>
-            </w:r>
-            <w:r>
-              <w:rPr>
-                <w:noProof/>
-                <w:webHidden/>
-              </w:rPr>
               <w:fldChar w:fldCharType="separate"/>
-            </w:r>
-            <w:r>
-              <w:rPr>
-                <w:noProof/>
-                <w:webHidden/>
-              </w:rPr>
               <w:t>17</w:t>
-            </w:r>
-            <w:r>
-              <w:rPr>
-                <w:noProof/>
-                <w:webHidden/>
-              </w:rPr>
               <w:fldChar w:fldCharType="end"/>
             </w:r>
           </w:hyperlink>
@@ -2864,46 +1456,10 @@
                 <w:webHidden/>
               </w:rPr>
               <w:tab/>
-            </w:r>
-            <w:r>
-              <w:rPr>
-                <w:noProof/>
-                <w:webHidden/>
-              </w:rPr>
               <w:fldChar w:fldCharType="begin"/>
-            </w:r>
-            <w:r>
-              <w:rPr>
-                <w:noProof/>
-                <w:webHidden/>
-              </w:rPr>
               <w:instrText xml:space="preserve"> PAGEREF _Toc236683300 \h </w:instrText>
-            </w:r>
-            <w:r>
-              <w:rPr>
-                <w:noProof/>
-                <w:webHidden/>
-              </w:rPr>
-            </w:r>
-            <w:r>
-              <w:rPr>
-                <w:noProof/>
-                <w:webHidden/>
-              </w:rPr>
               <w:fldChar w:fldCharType="separate"/>
-            </w:r>
-            <w:r>
-              <w:rPr>
-                <w:noProof/>
-                <w:webHidden/>
-              </w:rPr>
               <w:t>17</w:t>
-            </w:r>
-            <w:r>
-              <w:rPr>
-                <w:noProof/>
-                <w:webHidden/>
-              </w:rPr>
               <w:fldChar w:fldCharType="end"/>
             </w:r>
           </w:hyperlink>
@@ -2932,46 +1488,10 @@
                 <w:webHidden/>
               </w:rPr>
               <w:tab/>
-            </w:r>
-            <w:r>
-              <w:rPr>
-                <w:noProof/>
-                <w:webHidden/>
-              </w:rPr>
               <w:fldChar w:fldCharType="begin"/>
-            </w:r>
-            <w:r>
-              <w:rPr>
-                <w:noProof/>
-                <w:webHidden/>
-              </w:rPr>
               <w:instrText xml:space="preserve"> PAGEREF _Toc236683301 \h </w:instrText>
-            </w:r>
-            <w:r>
-              <w:rPr>
-                <w:noProof/>
-                <w:webHidden/>
-              </w:rPr>
-            </w:r>
-            <w:r>
-              <w:rPr>
-                <w:noProof/>
-                <w:webHidden/>
-              </w:rPr>
               <w:fldChar w:fldCharType="separate"/>
-            </w:r>
-            <w:r>
-              <w:rPr>
-                <w:noProof/>
-                <w:webHidden/>
-              </w:rPr>
               <w:t>18</w:t>
-            </w:r>
-            <w:r>
-              <w:rPr>
-                <w:noProof/>
-                <w:webHidden/>
-              </w:rPr>
               <w:fldChar w:fldCharType="end"/>
             </w:r>
           </w:hyperlink>
@@ -3000,46 +1520,10 @@
                 <w:webHidden/>
               </w:rPr>
               <w:tab/>
-            </w:r>
-            <w:r>
-              <w:rPr>
-                <w:noProof/>
-                <w:webHidden/>
-              </w:rPr>
               <w:fldChar w:fldCharType="begin"/>
-            </w:r>
-            <w:r>
-              <w:rPr>
-                <w:noProof/>
-                <w:webHidden/>
-              </w:rPr>
               <w:instrText xml:space="preserve"> PAGEREF _Toc236683302 \h </w:instrText>
-            </w:r>
-            <w:r>
-              <w:rPr>
-                <w:noProof/>
-                <w:webHidden/>
-              </w:rPr>
-            </w:r>
-            <w:r>
-              <w:rPr>
-                <w:noProof/>
-                <w:webHidden/>
-              </w:rPr>
               <w:fldChar w:fldCharType="separate"/>
-            </w:r>
-            <w:r>
-              <w:rPr>
-                <w:noProof/>
-                <w:webHidden/>
-              </w:rPr>
               <w:t>18</w:t>
-            </w:r>
-            <w:r>
-              <w:rPr>
-                <w:noProof/>
-                <w:webHidden/>
-              </w:rPr>
               <w:fldChar w:fldCharType="end"/>
             </w:r>
           </w:hyperlink>
@@ -3068,46 +1552,10 @@
                 <w:webHidden/>
               </w:rPr>
               <w:tab/>
-            </w:r>
-            <w:r>
-              <w:rPr>
-                <w:noProof/>
-                <w:webHidden/>
-              </w:rPr>
               <w:fldChar w:fldCharType="begin"/>
-            </w:r>
-            <w:r>
-              <w:rPr>
-                <w:noProof/>
-                <w:webHidden/>
-              </w:rPr>
               <w:instrText xml:space="preserve"> PAGEREF _Toc236683303 \h </w:instrText>
-            </w:r>
-            <w:r>
-              <w:rPr>
-                <w:noProof/>
-                <w:webHidden/>
-              </w:rPr>
-            </w:r>
-            <w:r>
-              <w:rPr>
-                <w:noProof/>
-                <w:webHidden/>
-              </w:rPr>
               <w:fldChar w:fldCharType="separate"/>
-            </w:r>
-            <w:r>
-              <w:rPr>
-                <w:noProof/>
-                <w:webHidden/>
-              </w:rPr>
               <w:t>19</w:t>
-            </w:r>
-            <w:r>
-              <w:rPr>
-                <w:noProof/>
-                <w:webHidden/>
-              </w:rPr>
               <w:fldChar w:fldCharType="end"/>
             </w:r>
           </w:hyperlink>
@@ -3136,46 +1584,10 @@
                 <w:webHidden/>
               </w:rPr>
               <w:tab/>
-            </w:r>
-            <w:r>
-              <w:rPr>
-                <w:noProof/>
-                <w:webHidden/>
-              </w:rPr>
               <w:fldChar w:fldCharType="begin"/>
-            </w:r>
-            <w:r>
-              <w:rPr>
-                <w:noProof/>
-                <w:webHidden/>
-              </w:rPr>
               <w:instrText xml:space="preserve"> PAGEREF _Toc236683304 \h </w:instrText>
-            </w:r>
-            <w:r>
-              <w:rPr>
-                <w:noProof/>
-                <w:webHidden/>
-              </w:rPr>
-            </w:r>
-            <w:r>
-              <w:rPr>
-                <w:noProof/>
-                <w:webHidden/>
-              </w:rPr>
               <w:fldChar w:fldCharType="separate"/>
-            </w:r>
-            <w:r>
-              <w:rPr>
-                <w:noProof/>
-                <w:webHidden/>
-              </w:rPr>
               <w:t>19</w:t>
-            </w:r>
-            <w:r>
-              <w:rPr>
-                <w:noProof/>
-                <w:webHidden/>
-              </w:rPr>
               <w:fldChar w:fldCharType="end"/>
             </w:r>
           </w:hyperlink>
@@ -3204,46 +1616,10 @@
                 <w:webHidden/>
               </w:rPr>
               <w:tab/>
-            </w:r>
-            <w:r>
-              <w:rPr>
-                <w:noProof/>
-                <w:webHidden/>
-              </w:rPr>
               <w:fldChar w:fldCharType="begin"/>
-            </w:r>
-            <w:r>
-              <w:rPr>
-                <w:noProof/>
-                <w:webHidden/>
-              </w:rPr>
               <w:instrText xml:space="preserve"> PAGEREF _Toc236683305 \h </w:instrText>
-            </w:r>
-            <w:r>
-              <w:rPr>
-                <w:noProof/>
-                <w:webHidden/>
-              </w:rPr>
-            </w:r>
-            <w:r>
-              <w:rPr>
-                <w:noProof/>
-                <w:webHidden/>
-              </w:rPr>
               <w:fldChar w:fldCharType="separate"/>
-            </w:r>
-            <w:r>
-              <w:rPr>
-                <w:noProof/>
-                <w:webHidden/>
-              </w:rPr>
               <w:t>21</w:t>
-            </w:r>
-            <w:r>
-              <w:rPr>
-                <w:noProof/>
-                <w:webHidden/>
-              </w:rPr>
               <w:fldChar w:fldCharType="end"/>
             </w:r>
           </w:hyperlink>
@@ -3272,46 +1648,10 @@
                 <w:webHidden/>
               </w:rPr>
               <w:tab/>
-            </w:r>
-            <w:r>
-              <w:rPr>
-                <w:noProof/>
-                <w:webHidden/>
-              </w:rPr>
               <w:fldChar w:fldCharType="begin"/>
-            </w:r>
-            <w:r>
-              <w:rPr>
-                <w:noProof/>
-                <w:webHidden/>
-              </w:rPr>
               <w:instrText xml:space="preserve"> PAGEREF _Toc236683306 \h </w:instrText>
-            </w:r>
-            <w:r>
-              <w:rPr>
-                <w:noProof/>
-                <w:webHidden/>
-              </w:rPr>
-            </w:r>
-            <w:r>
-              <w:rPr>
-                <w:noProof/>
-                <w:webHidden/>
-              </w:rPr>
               <w:fldChar w:fldCharType="separate"/>
-            </w:r>
-            <w:r>
-              <w:rPr>
-                <w:noProof/>
-                <w:webHidden/>
-              </w:rPr>
               <w:t>22</w:t>
-            </w:r>
-            <w:r>
-              <w:rPr>
-                <w:noProof/>
-                <w:webHidden/>
-              </w:rPr>
               <w:fldChar w:fldCharType="end"/>
             </w:r>
           </w:hyperlink>
@@ -3340,46 +1680,10 @@
                 <w:webHidden/>
               </w:rPr>
               <w:tab/>
-            </w:r>
-            <w:r>
-              <w:rPr>
-                <w:noProof/>
-                <w:webHidden/>
-              </w:rPr>
               <w:fldChar w:fldCharType="begin"/>
-            </w:r>
-            <w:r>
-              <w:rPr>
-                <w:noProof/>
-                <w:webHidden/>
-              </w:rPr>
               <w:instrText xml:space="preserve"> PAGEREF _Toc236683307 \h </w:instrText>
-            </w:r>
-            <w:r>
-              <w:rPr>
-                <w:noProof/>
-                <w:webHidden/>
-              </w:rPr>
-            </w:r>
-            <w:r>
-              <w:rPr>
-                <w:noProof/>
-                <w:webHidden/>
-              </w:rPr>
               <w:fldChar w:fldCharType="separate"/>
-            </w:r>
-            <w:r>
-              <w:rPr>
-                <w:noProof/>
-                <w:webHidden/>
-              </w:rPr>
               <w:t>22</w:t>
-            </w:r>
-            <w:r>
-              <w:rPr>
-                <w:noProof/>
-                <w:webHidden/>
-              </w:rPr>
               <w:fldChar w:fldCharType="end"/>
             </w:r>
           </w:hyperlink>
@@ -3408,46 +1712,10 @@
                 <w:webHidden/>
               </w:rPr>
               <w:tab/>
-            </w:r>
-            <w:r>
-              <w:rPr>
-                <w:noProof/>
-                <w:webHidden/>
-              </w:rPr>
               <w:fldChar w:fldCharType="begin"/>
-            </w:r>
-            <w:r>
-              <w:rPr>
-                <w:noProof/>
-                <w:webHidden/>
-              </w:rPr>
               <w:instrText xml:space="preserve"> PAGEREF _Toc236683308 \h </w:instrText>
-            </w:r>
-            <w:r>
-              <w:rPr>
-                <w:noProof/>
-                <w:webHidden/>
-              </w:rPr>
-            </w:r>
-            <w:r>
-              <w:rPr>
-                <w:noProof/>
-                <w:webHidden/>
-              </w:rPr>
               <w:fldChar w:fldCharType="separate"/>
-            </w:r>
-            <w:r>
-              <w:rPr>
-                <w:noProof/>
-                <w:webHidden/>
-              </w:rPr>
               <w:t>23</w:t>
-            </w:r>
-            <w:r>
-              <w:rPr>
-                <w:noProof/>
-                <w:webHidden/>
-              </w:rPr>
               <w:fldChar w:fldCharType="end"/>
             </w:r>
           </w:hyperlink>
@@ -3476,46 +1744,10 @@
                 <w:webHidden/>
               </w:rPr>
               <w:tab/>
-            </w:r>
-            <w:r>
-              <w:rPr>
-                <w:noProof/>
-                <w:webHidden/>
-              </w:rPr>
               <w:fldChar w:fldCharType="begin"/>
-            </w:r>
-            <w:r>
-              <w:rPr>
-                <w:noProof/>
-                <w:webHidden/>
-              </w:rPr>
               <w:instrText xml:space="preserve"> PAGEREF _Toc236683309 \h </w:instrText>
-            </w:r>
-            <w:r>
-              <w:rPr>
-                <w:noProof/>
-                <w:webHidden/>
-              </w:rPr>
-            </w:r>
-            <w:r>
-              <w:rPr>
-                <w:noProof/>
-                <w:webHidden/>
-              </w:rPr>
               <w:fldChar w:fldCharType="separate"/>
-            </w:r>
-            <w:r>
-              <w:rPr>
-                <w:noProof/>
-                <w:webHidden/>
-              </w:rPr>
               <w:t>24</w:t>
-            </w:r>
-            <w:r>
-              <w:rPr>
-                <w:noProof/>
-                <w:webHidden/>
-              </w:rPr>
               <w:fldChar w:fldCharType="end"/>
             </w:r>
           </w:hyperlink>
@@ -4910,7 +3142,7 @@
         <w:pStyle w:val="FirstParagraph"/>
       </w:pPr>
       <w:r>
-        <w:t>São mantidos dois registos complementares:</w:t>
+        <w:t>São mantidos três registos complementares:</w:t>
       </w:r>
     </w:p>
     <w:tbl>
@@ -5052,6 +3284,47 @@
           </w:p>
         </w:tc>
       </w:tr>
+      <w:tr>
+        <w:tc>
+          <w:tcPr>
+            <w:tcW w:w="0" w:type="auto"/>
+          </w:tcPr>
+          <w:p>
+            <w:pPr>
+              <w:pStyle w:val="Compact"/>
+            </w:pPr>
+            <w:r>
+              <w:t xml:space="preserve">Etiquetas Git</w:t>
+            </w:r>
+          </w:p>
+        </w:tc>
+        <w:tc>
+          <w:tcPr>
+            <w:tcW w:w="0" w:type="auto"/>
+          </w:tcPr>
+          <w:p>
+            <w:pPr>
+              <w:pStyle w:val="Compact"/>
+            </w:pPr>
+            <w:r>
+              <w:t xml:space="preserve">Por versão</w:t>
+            </w:r>
+          </w:p>
+        </w:tc>
+        <w:tc>
+          <w:tcPr>
+            <w:tcW w:w="0" w:type="auto"/>
+          </w:tcPr>
+          <w:p>
+            <w:pPr>
+              <w:pStyle w:val="Compact"/>
+            </w:pPr>
+            <w:r>
+              <w:t xml:space="preserve">Marca o ponto do código onde cada versão fecha</w:t>
+            </w:r>
+          </w:p>
+        </w:tc>
+      </w:tr>
     </w:tbl>
     <w:p>
       <w:pPr>
@@ -5210,6 +3483,930 @@
     </w:tbl>
     <w:p>
       <w:pPr>
+        <w:pStyle w:val="FirstParagraph"/>
+      </w:pPr>
+      <w:r>
+        <w:t xml:space="preserve">Sobre esta numeração aplica-se a convenção adotada pelo kernel Linux e pelo Node.js: o número </w:t>
+      </w:r>
+      <w:r>
+        <w:rPr>
+          <w:b/>
+          <w:bCs/>
+        </w:rPr>
+        <w:t xml:space="preserve">menor ímpar</w:t>
+      </w:r>
+      <w:r>
+        <w:t xml:space="preserve"> identifica versões de desenvolvimento e o </w:t>
+      </w:r>
+      <w:r>
+        <w:rPr>
+          <w:b/>
+          <w:bCs/>
+        </w:rPr>
+        <w:t xml:space="preserve">menor par</w:t>
+      </w:r>
+      <w:r>
+        <w:t xml:space="preserve"> identifica versões estabilizadas.</w:t>
+      </w:r>
+    </w:p>
+    <w:p>
+      <w:pPr>
+        <w:pStyle w:val="Corpodetexto"/>
+      </w:pPr>
+      <w:r>
+        <w:t xml:space="preserve">Nas versões pares não são acrescentadas funcionalidades. Reúnem o conteúdo da versão ímpar anterior depois de corrigido, testado e documentado, admitindo apenas correções de comportamento, revisão de estilo e documentação.</w:t>
+      </w:r>
+    </w:p>
+    <w:tbl>
+      <w:tblPr>
+        <w:tblStyle w:val="Table"/>
+        <w:tblW w:w="5000" w:type="pct"/>
+        <w:tblLook w:val="0020" w:firstRow="1" w:lastRow="0" w:firstColumn="0" w:lastColumn="0" w:noHBand="0" w:noVBand="0"/>
+      </w:tblPr>
+      <w:tblGrid>
+        <w:gridCol w:w="1800"/>
+        <w:gridCol w:w="2100"/>
+        <w:gridCol w:w="5460"/>
+      </w:tblGrid>
+      <w:tr>
+        <w:trPr>
+          <w:cnfStyle w:val="100000000000" w:firstRow="1" w:lastRow="0" w:firstColumn="0" w:lastColumn="0" w:oddVBand="0" w:evenVBand="0" w:oddHBand="0" w:evenHBand="0" w:firstRowFirstColumn="0" w:firstRowLastColumn="0" w:lastRowFirstColumn="0" w:lastRowLastColumn="0"/>
+          <w:tblHeader/>
+        </w:trPr>
+        <w:tc>
+          <w:tcPr>
+            <w:tcW w:w="0" w:type="auto"/>
+          </w:tcPr>
+          <w:p>
+            <w:pPr>
+              <w:pStyle w:val="Compact"/>
+            </w:pPr>
+            <w:r>
+              <w:rPr>
+                <w:b/>
+                <w:bCs/>
+              </w:rPr>
+              <w:t xml:space="preserve">Versão</w:t>
+            </w:r>
+          </w:p>
+        </w:tc>
+        <w:tc>
+          <w:tcPr>
+            <w:tcW w:w="0" w:type="auto"/>
+          </w:tcPr>
+          <w:p>
+            <w:pPr>
+              <w:pStyle w:val="Compact"/>
+            </w:pPr>
+            <w:r>
+              <w:rPr>
+                <w:b/>
+                <w:bCs/>
+              </w:rPr>
+              <w:t xml:space="preserve">Tipo</w:t>
+            </w:r>
+          </w:p>
+        </w:tc>
+        <w:tc>
+          <w:tcPr>
+            <w:tcW w:w="0" w:type="auto"/>
+          </w:tcPr>
+          <w:p>
+            <w:pPr>
+              <w:pStyle w:val="Compact"/>
+            </w:pPr>
+            <w:r>
+              <w:rPr>
+                <w:b/>
+                <w:bCs/>
+              </w:rPr>
+              <w:t xml:space="preserve">Conteúdo</w:t>
+            </w:r>
+          </w:p>
+        </w:tc>
+      </w:tr>
+      <w:tr>
+        <w:tc>
+          <w:tcPr>
+            <w:tcW w:w="0" w:type="auto"/>
+          </w:tcPr>
+          <w:p>
+            <w:pPr>
+              <w:pStyle w:val="Compact"/>
+            </w:pPr>
+            <w:r>
+              <w:t xml:space="preserve">Menor ímpar</w:t>
+            </w:r>
+          </w:p>
+        </w:tc>
+        <w:tc>
+          <w:tcPr>
+            <w:tcW w:w="0" w:type="auto"/>
+          </w:tcPr>
+          <w:p>
+            <w:pPr>
+              <w:pStyle w:val="Compact"/>
+            </w:pPr>
+            <w:r>
+              <w:t xml:space="preserve">Desenvolvimento</w:t>
+            </w:r>
+          </w:p>
+        </w:tc>
+        <w:tc>
+          <w:tcPr>
+            <w:tcW w:w="0" w:type="auto"/>
+          </w:tcPr>
+          <w:p>
+            <w:pPr>
+              <w:pStyle w:val="Compact"/>
+            </w:pPr>
+            <w:r>
+              <w:t xml:space="preserve">Funcionalidade nova; os testes podem falhar</w:t>
+            </w:r>
+          </w:p>
+        </w:tc>
+      </w:tr>
+      <w:tr>
+        <w:tc>
+          <w:tcPr>
+            <w:tcW w:w="0" w:type="auto"/>
+          </w:tcPr>
+          <w:p>
+            <w:pPr>
+              <w:pStyle w:val="Compact"/>
+            </w:pPr>
+            <w:r>
+              <w:t xml:space="preserve">Menor par</w:t>
+            </w:r>
+          </w:p>
+        </w:tc>
+        <w:tc>
+          <w:tcPr>
+            <w:tcW w:w="0" w:type="auto"/>
+          </w:tcPr>
+          <w:p>
+            <w:pPr>
+              <w:pStyle w:val="Compact"/>
+            </w:pPr>
+            <w:r>
+              <w:t xml:space="preserve">Estabilizada</w:t>
+            </w:r>
+          </w:p>
+        </w:tc>
+        <w:tc>
+          <w:tcPr>
+            <w:tcW w:w="0" w:type="auto"/>
+          </w:tcPr>
+          <w:p>
+            <w:pPr>
+              <w:pStyle w:val="Compact"/>
+            </w:pPr>
+            <w:r>
+              <w:t xml:space="preserve">Sem funcionalidade nova; testes verdes, PEP 8 revisto, documentação completa</w:t>
+            </w:r>
+          </w:p>
+        </w:tc>
+      </w:tr>
+    </w:tbl>
+    <w:p>
+      <w:pPr>
+        <w:pStyle w:val="FirstParagraph"/>
+      </w:pPr>
+      <w:r>
+        <w:rPr>
+          <w:b/>
+          <w:bCs/>
+        </w:rPr>
+        <w:t xml:space="preserve">Divergência face à numeração semântica:</w:t>
+      </w:r>
+      <w:r>
+        <w:t xml:space="preserve"> na numeração semântica estrita, uma versão que apenas corrija comportamento incrementaria o terceiro número e não o segundo. A convenção adotada incrementa o número menor, atribuindo-lhe simultaneamente o significado de maturidade da versão.</w:t>
+      </w:r>
+    </w:p>
+    <w:p>
+      <w:pPr>
+        <w:pStyle w:val="Corpodetexto"/>
+      </w:pPr>
+      <w:r>
+        <w:rPr>
+          <w:b/>
+          <w:bCs/>
+        </w:rPr>
+        <w:t xml:space="preserve">Justificação:</w:t>
+      </w:r>
+      <w:r>
+        <w:t xml:space="preserve"> a numeração semântica indica o que mudou, mas não o estado de maturidade da versão. Num projeto entregue por fases, saber se uma versão está consolidada é informação mais útil do que saber se houve funcionalidade nova. A convenção impõe ainda ciclos regulares de consolidação — execução dos testes, revisão de estilo e documentação — em vez de os remeter para o final do desenvolvimento.</w:t>
+      </w:r>
+    </w:p>
+    <w:p>
+      <w:pPr>
+        <w:pStyle w:val="Corpodetexto"/>
+      </w:pPr>
+      <w:r>
+        <w:rPr>
+          <w:b/>
+          <w:bCs/>
+        </w:rPr>
+        <w:t xml:space="preserve">Aplicação ao projeto:</w:t>
+      </w:r>
+      <w:r>
+        <w:t xml:space="preserve"> a Fase 1 encerra na versão 1.0.0 e a Fase 2 na versão 2.0.0, ambas versões maiores e estabilizadas. Entre elas alternam versões ímpares de construção e versões pares de consolidação, uma por grupo de módulos.</w:t>
+      </w:r>
+    </w:p>
+    <w:tbl>
+      <w:tblPr>
+        <w:tblStyle w:val="Table"/>
+        <w:tblW w:w="5000" w:type="pct"/>
+        <w:tblLook w:val="0020" w:firstRow="1" w:lastRow="0" w:firstColumn="0" w:lastColumn="0" w:noHBand="0" w:noVBand="0"/>
+      </w:tblPr>
+      <w:tblGrid>
+        <w:gridCol w:w="1500"/>
+        <w:gridCol w:w="5400"/>
+        <w:gridCol w:w="2460"/>
+      </w:tblGrid>
+      <w:tr>
+        <w:trPr>
+          <w:cnfStyle w:val="100000000000" w:firstRow="1" w:lastRow="0" w:firstColumn="0" w:lastColumn="0" w:oddVBand="0" w:evenVBand="0" w:oddHBand="0" w:evenHBand="0" w:firstRowFirstColumn="0" w:firstRowLastColumn="0" w:lastRowFirstColumn="0" w:lastRowLastColumn="0"/>
+          <w:tblHeader/>
+        </w:trPr>
+        <w:tc>
+          <w:tcPr>
+            <w:tcW w:w="0" w:type="auto"/>
+          </w:tcPr>
+          <w:p>
+            <w:pPr>
+              <w:pStyle w:val="Compact"/>
+            </w:pPr>
+            <w:r>
+              <w:rPr>
+                <w:b/>
+                <w:bCs/>
+              </w:rPr>
+              <w:t xml:space="preserve">Versão</w:t>
+            </w:r>
+          </w:p>
+        </w:tc>
+        <w:tc>
+          <w:tcPr>
+            <w:tcW w:w="0" w:type="auto"/>
+          </w:tcPr>
+          <w:p>
+            <w:pPr>
+              <w:pStyle w:val="Compact"/>
+            </w:pPr>
+            <w:r>
+              <w:rPr>
+                <w:b/>
+                <w:bCs/>
+              </w:rPr>
+              <w:t xml:space="preserve">Grupo de módulos</w:t>
+            </w:r>
+          </w:p>
+        </w:tc>
+        <w:tc>
+          <w:tcPr>
+            <w:tcW w:w="0" w:type="auto"/>
+          </w:tcPr>
+          <w:p>
+            <w:pPr>
+              <w:pStyle w:val="Compact"/>
+            </w:pPr>
+            <w:r>
+              <w:rPr>
+                <w:b/>
+                <w:bCs/>
+              </w:rPr>
+              <w:t xml:space="preserve">Tipo</w:t>
+            </w:r>
+          </w:p>
+        </w:tc>
+      </w:tr>
+      <w:tr>
+        <w:tc>
+          <w:tcPr>
+            <w:tcW w:w="0" w:type="auto"/>
+          </w:tcPr>
+          <w:p>
+            <w:pPr>
+              <w:pStyle w:val="Compact"/>
+            </w:pPr>
+            <w:r>
+              <w:t xml:space="preserve">0.1.0</w:t>
+            </w:r>
+          </w:p>
+        </w:tc>
+        <w:tc>
+          <w:tcPr>
+            <w:tcW w:w="0" w:type="auto"/>
+          </w:tcPr>
+          <w:p>
+            <w:pPr>
+              <w:pStyle w:val="Compact"/>
+            </w:pPr>
+            <w:r>
+              <w:t xml:space="preserve">Análise e desenho (documentos)</w:t>
+            </w:r>
+          </w:p>
+        </w:tc>
+        <w:tc>
+          <w:tcPr>
+            <w:tcW w:w="0" w:type="auto"/>
+          </w:tcPr>
+          <w:p>
+            <w:pPr>
+              <w:pStyle w:val="Compact"/>
+            </w:pPr>
+            <w:r>
+              <w:t xml:space="preserve">ímpar</w:t>
+            </w:r>
+          </w:p>
+        </w:tc>
+      </w:tr>
+      <w:tr>
+        <w:tc>
+          <w:tcPr>
+            <w:tcW w:w="0" w:type="auto"/>
+          </w:tcPr>
+          <w:p>
+            <w:pPr>
+              <w:pStyle w:val="Compact"/>
+            </w:pPr>
+            <w:r>
+              <w:t xml:space="preserve">0.2.0</w:t>
+            </w:r>
+          </w:p>
+        </w:tc>
+        <w:tc>
+          <w:tcPr>
+            <w:tcW w:w="0" w:type="auto"/>
+          </w:tcPr>
+          <w:p>
+            <w:pPr>
+              <w:pStyle w:val="Compact"/>
+            </w:pPr>
+            <w:r>
+              <w:t xml:space="preserve">config, modelos, repositorio, validacoes</w:t>
+            </w:r>
+          </w:p>
+        </w:tc>
+        <w:tc>
+          <w:tcPr>
+            <w:tcW w:w="0" w:type="auto"/>
+          </w:tcPr>
+          <w:p>
+            <w:pPr>
+              <w:pStyle w:val="Compact"/>
+            </w:pPr>
+            <w:r>
+              <w:t xml:space="preserve">par</w:t>
+            </w:r>
+          </w:p>
+        </w:tc>
+      </w:tr>
+      <w:tr>
+        <w:tc>
+          <w:tcPr>
+            <w:tcW w:w="0" w:type="auto"/>
+          </w:tcPr>
+          <w:p>
+            <w:pPr>
+              <w:pStyle w:val="Compact"/>
+            </w:pPr>
+            <w:r>
+              <w:t xml:space="preserve">0.3.0</w:t>
+            </w:r>
+          </w:p>
+        </w:tc>
+        <w:tc>
+          <w:tcPr>
+            <w:tcW w:w="0" w:type="auto"/>
+          </w:tcPr>
+          <w:p>
+            <w:pPr>
+              <w:pStyle w:val="Compact"/>
+            </w:pPr>
+            <w:r>
+              <w:t xml:space="preserve">propriedades, unidades</w:t>
+            </w:r>
+          </w:p>
+        </w:tc>
+        <w:tc>
+          <w:tcPr>
+            <w:tcW w:w="0" w:type="auto"/>
+          </w:tcPr>
+          <w:p>
+            <w:pPr>
+              <w:pStyle w:val="Compact"/>
+            </w:pPr>
+            <w:r>
+              <w:t xml:space="preserve">ímpar</w:t>
+            </w:r>
+          </w:p>
+        </w:tc>
+      </w:tr>
+      <w:tr>
+        <w:tc>
+          <w:tcPr>
+            <w:tcW w:w="0" w:type="auto"/>
+          </w:tcPr>
+          <w:p>
+            <w:pPr>
+              <w:pStyle w:val="Compact"/>
+            </w:pPr>
+            <w:r>
+              <w:t xml:space="preserve">0.4.0</w:t>
+            </w:r>
+          </w:p>
+        </w:tc>
+        <w:tc>
+          <w:tcPr>
+            <w:tcW w:w="0" w:type="auto"/>
+          </w:tcPr>
+          <w:p>
+            <w:pPr>
+              <w:pStyle w:val="Compact"/>
+            </w:pPr>
+            <w:r>
+              <w:t xml:space="preserve">clientes, responsaveis</w:t>
+            </w:r>
+          </w:p>
+        </w:tc>
+        <w:tc>
+          <w:tcPr>
+            <w:tcW w:w="0" w:type="auto"/>
+          </w:tcPr>
+          <w:p>
+            <w:pPr>
+              <w:pStyle w:val="Compact"/>
+            </w:pPr>
+            <w:r>
+              <w:t xml:space="preserve">par</w:t>
+            </w:r>
+          </w:p>
+        </w:tc>
+      </w:tr>
+      <w:tr>
+        <w:tc>
+          <w:tcPr>
+            <w:tcW w:w="0" w:type="auto"/>
+          </w:tcPr>
+          <w:p>
+            <w:pPr>
+              <w:pStyle w:val="Compact"/>
+            </w:pPr>
+            <w:r>
+              <w:t xml:space="preserve">0.5.0</w:t>
+            </w:r>
+          </w:p>
+        </w:tc>
+        <w:tc>
+          <w:tcPr>
+            <w:tcW w:w="0" w:type="auto"/>
+          </w:tcPr>
+          <w:p>
+            <w:pPr>
+              <w:pStyle w:val="Compact"/>
+            </w:pPr>
+            <w:r>
+              <w:t xml:space="preserve">contratos</w:t>
+            </w:r>
+          </w:p>
+        </w:tc>
+        <w:tc>
+          <w:tcPr>
+            <w:tcW w:w="0" w:type="auto"/>
+          </w:tcPr>
+          <w:p>
+            <w:pPr>
+              <w:pStyle w:val="Compact"/>
+            </w:pPr>
+            <w:r>
+              <w:t xml:space="preserve">ímpar</w:t>
+            </w:r>
+          </w:p>
+        </w:tc>
+      </w:tr>
+      <w:tr>
+        <w:tc>
+          <w:tcPr>
+            <w:tcW w:w="0" w:type="auto"/>
+          </w:tcPr>
+          <w:p>
+            <w:pPr>
+              <w:pStyle w:val="Compact"/>
+            </w:pPr>
+            <w:r>
+              <w:t xml:space="preserve">0.6.0</w:t>
+            </w:r>
+          </w:p>
+        </w:tc>
+        <w:tc>
+          <w:tcPr>
+            <w:tcW w:w="0" w:type="auto"/>
+          </w:tcPr>
+          <w:p>
+            <w:pPr>
+              <w:pStyle w:val="Compact"/>
+            </w:pPr>
+            <w:r>
+              <w:t xml:space="preserve">estoque</w:t>
+            </w:r>
+          </w:p>
+        </w:tc>
+        <w:tc>
+          <w:tcPr>
+            <w:tcW w:w="0" w:type="auto"/>
+          </w:tcPr>
+          <w:p>
+            <w:pPr>
+              <w:pStyle w:val="Compact"/>
+            </w:pPr>
+            <w:r>
+              <w:t xml:space="preserve">par</w:t>
+            </w:r>
+          </w:p>
+        </w:tc>
+      </w:tr>
+      <w:tr>
+        <w:tc>
+          <w:tcPr>
+            <w:tcW w:w="0" w:type="auto"/>
+          </w:tcPr>
+          <w:p>
+            <w:pPr>
+              <w:pStyle w:val="Compact"/>
+            </w:pPr>
+            <w:r>
+              <w:t xml:space="preserve">0.7.0</w:t>
+            </w:r>
+          </w:p>
+        </w:tc>
+        <w:tc>
+          <w:tcPr>
+            <w:tcW w:w="0" w:type="auto"/>
+          </w:tcPr>
+          <w:p>
+            <w:pPr>
+              <w:pStyle w:val="Compact"/>
+            </w:pPr>
+            <w:r>
+              <w:t xml:space="preserve">cli, main</w:t>
+            </w:r>
+          </w:p>
+        </w:tc>
+        <w:tc>
+          <w:tcPr>
+            <w:tcW w:w="0" w:type="auto"/>
+          </w:tcPr>
+          <w:p>
+            <w:pPr>
+              <w:pStyle w:val="Compact"/>
+            </w:pPr>
+            <w:r>
+              <w:t xml:space="preserve">ímpar</w:t>
+            </w:r>
+          </w:p>
+        </w:tc>
+      </w:tr>
+      <w:tr>
+        <w:tc>
+          <w:tcPr>
+            <w:tcW w:w="0" w:type="auto"/>
+          </w:tcPr>
+          <w:p>
+            <w:pPr>
+              <w:pStyle w:val="Compact"/>
+            </w:pPr>
+            <w:r>
+              <w:t xml:space="preserve">1.0.0</w:t>
+            </w:r>
+          </w:p>
+        </w:tc>
+        <w:tc>
+          <w:tcPr>
+            <w:tcW w:w="0" w:type="auto"/>
+          </w:tcPr>
+          <w:p>
+            <w:pPr>
+              <w:pStyle w:val="Compact"/>
+            </w:pPr>
+            <w:r>
+              <w:t xml:space="preserve">Fase 1 completa</w:t>
+            </w:r>
+          </w:p>
+        </w:tc>
+        <w:tc>
+          <w:tcPr>
+            <w:tcW w:w="0" w:type="auto"/>
+          </w:tcPr>
+          <w:p>
+            <w:pPr>
+              <w:pStyle w:val="Compact"/>
+            </w:pPr>
+            <w:r>
+              <w:t xml:space="preserve">maior, estável</w:t>
+            </w:r>
+          </w:p>
+        </w:tc>
+      </w:tr>
+      <w:tr>
+        <w:tc>
+          <w:tcPr>
+            <w:tcW w:w="0" w:type="auto"/>
+          </w:tcPr>
+          <w:p>
+            <w:pPr>
+              <w:pStyle w:val="Compact"/>
+            </w:pPr>
+            <w:r>
+              <w:t xml:space="preserve">1.1.0</w:t>
+            </w:r>
+          </w:p>
+        </w:tc>
+        <w:tc>
+          <w:tcPr>
+            <w:tcW w:w="0" w:type="auto"/>
+          </w:tcPr>
+          <w:p>
+            <w:pPr>
+              <w:pStyle w:val="Compact"/>
+            </w:pPr>
+            <w:r>
+              <w:t xml:space="preserve">Migração JSON para SQLite</w:t>
+            </w:r>
+          </w:p>
+        </w:tc>
+        <w:tc>
+          <w:tcPr>
+            <w:tcW w:w="0" w:type="auto"/>
+          </w:tcPr>
+          <w:p>
+            <w:pPr>
+              <w:pStyle w:val="Compact"/>
+            </w:pPr>
+            <w:r>
+              <w:t xml:space="preserve">ímpar</w:t>
+            </w:r>
+          </w:p>
+        </w:tc>
+      </w:tr>
+      <w:tr>
+        <w:tc>
+          <w:tcPr>
+            <w:tcW w:w="0" w:type="auto"/>
+          </w:tcPr>
+          <w:p>
+            <w:pPr>
+              <w:pStyle w:val="Compact"/>
+            </w:pPr>
+            <w:r>
+              <w:t xml:space="preserve">1.2.0</w:t>
+            </w:r>
+          </w:p>
+        </w:tc>
+        <w:tc>
+          <w:tcPr>
+            <w:tcW w:w="0" w:type="auto"/>
+          </w:tcPr>
+          <w:p>
+            <w:pPr>
+              <w:pStyle w:val="Compact"/>
+            </w:pPr>
+            <w:r>
+              <w:t xml:space="preserve">Persistência estabilizada</w:t>
+            </w:r>
+          </w:p>
+        </w:tc>
+        <w:tc>
+          <w:tcPr>
+            <w:tcW w:w="0" w:type="auto"/>
+          </w:tcPr>
+          <w:p>
+            <w:pPr>
+              <w:pStyle w:val="Compact"/>
+            </w:pPr>
+            <w:r>
+              <w:t xml:space="preserve">par</w:t>
+            </w:r>
+          </w:p>
+        </w:tc>
+      </w:tr>
+      <w:tr>
+        <w:tc>
+          <w:tcPr>
+            <w:tcW w:w="0" w:type="auto"/>
+          </w:tcPr>
+          <w:p>
+            <w:pPr>
+              <w:pStyle w:val="Compact"/>
+            </w:pPr>
+            <w:r>
+              <w:t xml:space="preserve">1.3.0</w:t>
+            </w:r>
+          </w:p>
+        </w:tc>
+        <w:tc>
+          <w:tcPr>
+            <w:tcW w:w="0" w:type="auto"/>
+          </w:tcPr>
+          <w:p>
+            <w:pPr>
+              <w:pStyle w:val="Compact"/>
+            </w:pPr>
+            <w:r>
+              <w:t xml:space="preserve">gui.py em CustomTkinter</w:t>
+            </w:r>
+          </w:p>
+        </w:tc>
+        <w:tc>
+          <w:tcPr>
+            <w:tcW w:w="0" w:type="auto"/>
+          </w:tcPr>
+          <w:p>
+            <w:pPr>
+              <w:pStyle w:val="Compact"/>
+            </w:pPr>
+            <w:r>
+              <w:t xml:space="preserve">ímpar</w:t>
+            </w:r>
+          </w:p>
+        </w:tc>
+      </w:tr>
+      <w:tr>
+        <w:tc>
+          <w:tcPr>
+            <w:tcW w:w="0" w:type="auto"/>
+          </w:tcPr>
+          <w:p>
+            <w:pPr>
+              <w:pStyle w:val="Compact"/>
+            </w:pPr>
+            <w:r>
+              <w:t xml:space="preserve">1.4.0</w:t>
+            </w:r>
+          </w:p>
+        </w:tc>
+        <w:tc>
+          <w:tcPr>
+            <w:tcW w:w="0" w:type="auto"/>
+          </w:tcPr>
+          <w:p>
+            <w:pPr>
+              <w:pStyle w:val="Compact"/>
+            </w:pPr>
+            <w:r>
+              <w:t xml:space="preserve">Interface estabilizada</w:t>
+            </w:r>
+          </w:p>
+        </w:tc>
+        <w:tc>
+          <w:tcPr>
+            <w:tcW w:w="0" w:type="auto"/>
+          </w:tcPr>
+          <w:p>
+            <w:pPr>
+              <w:pStyle w:val="Compact"/>
+            </w:pPr>
+            <w:r>
+              <w:t xml:space="preserve">par</w:t>
+            </w:r>
+          </w:p>
+        </w:tc>
+      </w:tr>
+      <w:tr>
+        <w:tc>
+          <w:tcPr>
+            <w:tcW w:w="0" w:type="auto"/>
+          </w:tcPr>
+          <w:p>
+            <w:pPr>
+              <w:pStyle w:val="Compact"/>
+            </w:pPr>
+            <w:r>
+              <w:t xml:space="preserve">1.5.0</w:t>
+            </w:r>
+          </w:p>
+        </w:tc>
+        <w:tc>
+          <w:tcPr>
+            <w:tcW w:w="0" w:type="auto"/>
+          </w:tcPr>
+          <w:p>
+            <w:pPr>
+              <w:pStyle w:val="Compact"/>
+            </w:pPr>
+            <w:r>
+              <w:t xml:space="preserve">financeiro, relatorios, utilizadores</w:t>
+            </w:r>
+          </w:p>
+        </w:tc>
+        <w:tc>
+          <w:tcPr>
+            <w:tcW w:w="0" w:type="auto"/>
+          </w:tcPr>
+          <w:p>
+            <w:pPr>
+              <w:pStyle w:val="Compact"/>
+            </w:pPr>
+            <w:r>
+              <w:t xml:space="preserve">ímpar</w:t>
+            </w:r>
+          </w:p>
+        </w:tc>
+      </w:tr>
+      <w:tr>
+        <w:tc>
+          <w:tcPr>
+            <w:tcW w:w="0" w:type="auto"/>
+          </w:tcPr>
+          <w:p>
+            <w:pPr>
+              <w:pStyle w:val="Compact"/>
+            </w:pPr>
+            <w:r>
+              <w:t xml:space="preserve">1.6.0</w:t>
+            </w:r>
+          </w:p>
+        </w:tc>
+        <w:tc>
+          <w:tcPr>
+            <w:tcW w:w="0" w:type="auto"/>
+          </w:tcPr>
+          <w:p>
+            <w:pPr>
+              <w:pStyle w:val="Compact"/>
+            </w:pPr>
+            <w:r>
+              <w:t xml:space="preserve">Módulos da Fase 2 estabilizados</w:t>
+            </w:r>
+          </w:p>
+        </w:tc>
+        <w:tc>
+          <w:tcPr>
+            <w:tcW w:w="0" w:type="auto"/>
+          </w:tcPr>
+          <w:p>
+            <w:pPr>
+              <w:pStyle w:val="Compact"/>
+            </w:pPr>
+            <w:r>
+              <w:t xml:space="preserve">par</w:t>
+            </w:r>
+          </w:p>
+        </w:tc>
+      </w:tr>
+      <w:tr>
+        <w:tc>
+          <w:tcPr>
+            <w:tcW w:w="0" w:type="auto"/>
+          </w:tcPr>
+          <w:p>
+            <w:pPr>
+              <w:pStyle w:val="Compact"/>
+            </w:pPr>
+            <w:r>
+              <w:t xml:space="preserve">2.0.0</w:t>
+            </w:r>
+          </w:p>
+        </w:tc>
+        <w:tc>
+          <w:tcPr>
+            <w:tcW w:w="0" w:type="auto"/>
+          </w:tcPr>
+          <w:p>
+            <w:pPr>
+              <w:pStyle w:val="Compact"/>
+            </w:pPr>
+            <w:r>
+              <w:t xml:space="preserve">Fase 2 completa — entrega de outubro</w:t>
+            </w:r>
+          </w:p>
+        </w:tc>
+        <w:tc>
+          <w:tcPr>
+            <w:tcW w:w="0" w:type="auto"/>
+          </w:tcPr>
+          <w:p>
+            <w:pPr>
+              <w:pStyle w:val="Compact"/>
+            </w:pPr>
+            <w:r>
+              <w:t xml:space="preserve">maior, estável</w:t>
+            </w:r>
+          </w:p>
+        </w:tc>
+      </w:tr>
+    </w:tbl>
+    <w:p>
+      <w:pPr>
+        <w:pStyle w:val="FirstParagraph"/>
+      </w:pPr>
+      <w:r>
+        <w:t xml:space="preserve">Uma versão só encerra quando todos os módulos do respetivo grupo cumprem os critérios de conclusão definidos na secção 3: funciona, tem testes, respeita a PEP 8, está documentado e está integrado no ramo principal. O encerramento é marcado com uma etiqueta Git anotada.</w:t>
+      </w:r>
+    </w:p>
+    <w:p>
+      <w:pPr>
         <w:pStyle w:val="Ttulo1"/>
       </w:pPr>
       <w:bookmarkStart w:id="27" w:name="_Toc236683272"/>
@@ -6164,8 +5361,6 @@
       </w:r>
       <w:r>
         <w:t xml:space="preserve"> na Fase 1 o sistema utiliza apenas a biblioteca padrão, pelo que o isolamento tem pouco efeito prático. Torna-se relevante na Fase 2, com a </w:t>
-      </w:r>
-      <w:r>
         <w:lastRenderedPageBreak/>
         <w:t>introdução de bibliotecas externas, e desde já para a entrega: o ficheiro de dependências permite reconstruir o ambiente com um único comando.</w:t>
       </w:r>
@@ -6470,78 +5665,40 @@
       </w:pPr>
       <w:r>
         <w:t>projeto/</w:t>
-      </w:r>
-      <w:r>
         <w:br/>
         <w:t>├── src/              módulos do sistema</w:t>
-      </w:r>
-      <w:r>
         <w:br/>
         <w:t>├── testes/           testes automáticos</w:t>
-      </w:r>
-      <w:r>
         <w:br/>
         <w:t>├── dados/            ficheiros JSON (excluído do controlo de versões)</w:t>
-      </w:r>
-      <w:r>
         <w:br/>
         <w:t>├── backups/          cópias diárias (excluído do controlo de versões)</w:t>
-      </w:r>
-      <w:r>
         <w:br/>
         <w:t>├── docs/             documentação</w:t>
-      </w:r>
-      <w:r>
         <w:br/>
         <w:t>├── .gitignore</w:t>
-      </w:r>
-      <w:r>
         <w:br/>
         <w:t>├── requirements.txt</w:t>
-      </w:r>
-      <w:r>
         <w:br/>
         <w:t>├── CHANGELOG.md</w:t>
-      </w:r>
-      <w:r>
         <w:br/>
         <w:t>└── README.md</w:t>
-      </w:r>
-      <w:r>
         <w:br/>
-      </w:r>
-      <w:r>
         <w:br/>
         <w:t>A partir da Fase 3, o projeto Django ocupa uma pasta própria,</w:t>
-      </w:r>
-      <w:r>
         <w:br/>
         <w:t>ao lado de src/, e invoca os mesmos módulos de negócio:</w:t>
-      </w:r>
-      <w:r>
         <w:br/>
-      </w:r>
-      <w:r>
         <w:br/>
         <w:t>projeto/</w:t>
-      </w:r>
-      <w:r>
         <w:br/>
         <w:t>├── src/              lógica de negócio (inalterada)</w:t>
-      </w:r>
-      <w:r>
         <w:br/>
         <w:t>├── web/              projeto Django (Fase 3)</w:t>
-      </w:r>
-      <w:r>
         <w:br/>
         <w:t>│   ├── manage.py</w:t>
-      </w:r>
-      <w:r>
         <w:br/>
         <w:t>│   └── gestao/       modelos, vistas e configuração</w:t>
-      </w:r>
-      <w:r>
         <w:br/>
         <w:t>└── ...</w:t>
       </w:r>
@@ -6586,8 +5743,6 @@
       </w:r>
       <w:r>
         <w:t xml:space="preserve">. Esta medida decorre da secção sobre proteção de dados </w:t>
-      </w:r>
-      <w:r>
         <w:lastRenderedPageBreak/>
         <w:t>pessoais e responde a uma situação anteriormente verificada, em que dados pessoais reais foram inadvertidamente incluídos num repositório público.</w:t>
       </w:r>
@@ -12231,8 +11386,6 @@
       </w:r>
       <w:r>
         <w:t xml:space="preserve"> a especificação previa definição manual da multa. A introdução de um valor configurável elimina a introdução repetida do mesmo montante, mantendo a possibilidade </w:t>
-      </w:r>
-      <w:r>
         <w:lastRenderedPageBreak/>
         <w:t>de ajuste. O registo da hora de chegada permite verificar o limite das 17:00 previsto na especificação.</w:t>
       </w:r>
@@ -16037,8 +15190,6 @@
       </w:pPr>
       <w:r>
         <w:t>Política de cancelamento | Especificação remete para a política do Airbnb |</w:t>
-      </w:r>
-      <w:r>
         <w:br/>
         <w:t>Fluxo de repasse do Airbnb | Registo manual na Fase 1 |</w:t>
       </w:r>

</xml_diff>